<commit_message>
Cert para 25: quote PO's verbatim 'a judge wouldn't see it that way'; narrow open question to 'snuck in'
Co-Authored-By: Claude Opus 5.5 <noreply@anthropic.com>
Claude-Session: https://claude.ai/code/session_01ScV4zYETA7REj3uJ3M3K7f
</commit_message>
<xml_diff>
--- a/case-files/bernecky/CERTIFICATION-v1.docx
+++ b/case-files/bernecky/CERTIFICATION-v1.docx
@@ -1490,17 +1490,17 @@
           <w:sz w:val="24"/>
           <w:szCs w:val="24"/>
         </w:rPr>
-        <w:t xml:space="preserve">25. My probation officer then told me that I should not have gone, because minors could possibly have been there, including minors who could have snuck in without my knowing. I said that a grocery store carries a much greater chance of being near minors than an event like that. She answered that a judge would not see it that way. </w:t>
-      </w:r>
-      <w:r>
-        <w:rPr>
-          <w:rFonts w:ascii="Times New Roman" w:cs="Times New Roman" w:eastAsia="Times New Roman" w:hAnsi="Times New Roman"/>
-          <w:b/>
-          <w:bCs/>
-          <w:sz w:val="24"/>
-          <w:szCs w:val="24"/>
-        </w:rPr>
-        <w:t xml:space="preserve">[Give the date, say how Probation learned of the event, and say whether these are her exact words or the substance of what she said.]</w:t>
+        <w:t xml:space="preserve">25. My probation officer then told me that I should not have gone, because minors could possibly have been there, including minors who could have snuck in without my knowing. I said that a grocery store carries a much greater chance of being near minors than an event like that. She answered, “a judge wouldn’t see it that way.” </w:t>
+      </w:r>
+      <w:r>
+        <w:rPr>
+          <w:rFonts w:ascii="Times New Roman" w:cs="Times New Roman" w:eastAsia="Times New Roman" w:hAnsi="Times New Roman"/>
+          <w:b/>
+          <w:bCs/>
+          <w:sz w:val="24"/>
+          <w:szCs w:val="24"/>
+        </w:rPr>
+        <w:t xml:space="preserve">[Give the date, say how Probation learned of the event, and say whether “snuck in” was her exact wording or the substance of what she said.]</w:t>
       </w:r>
     </w:p>
     <w:p>

</xml_diff>

<commit_message>
Cert: Jeff enjoys games and stopped playing entirely though not told to; told software takes full screenshots anytime; no protection or procedure for lawful material
Co-Authored-By: Claude Opus 5.5 <noreply@anthropic.com>
Claude-Session: https://claude.ai/code/session_01ScV4zYETA7REj3uJ3M3K7f
</commit_message>
<xml_diff>
--- a/case-files/bernecky/CERTIFICATION-v1.docx
+++ b/case-files/bernecky/CERTIFICATION-v1.docx
@@ -1134,7 +1134,7 @@
           <w:sz w:val="24"/>
           <w:szCs w:val="24"/>
         </w:rPr>
-        <w:t xml:space="preserve">17. I play games on my phone. Some of these games let players exchange typed messages. I play these games only on my phone, which has the Probation Office’s monitoring software installed. </w:t>
+        <w:t xml:space="preserve">17. I enjoy playing video games. Until the instruction described in paragraphs 19 and 20, I played games on my phone, including games that let players exchange typed messages. I played them only on my phone, which has the Probation Office’s monitoring software installed. </w:t>
       </w:r>
       <w:r>
         <w:rPr>
@@ -1238,17 +1238,17 @@
           <w:sz w:val="24"/>
           <w:szCs w:val="24"/>
         </w:rPr>
-        <w:t xml:space="preserve">, told me that she had noticed that I had been speaking with people in online games, and that I needed to stop. She did not tell me how she had noticed. I had not told her about those conversations. </w:t>
-      </w:r>
-      <w:r>
-        <w:rPr>
-          <w:rFonts w:ascii="Times New Roman" w:cs="Times New Roman" w:eastAsia="Times New Roman" w:hAnsi="Times New Roman"/>
-          <w:b/>
-          <w:bCs/>
-          <w:sz w:val="24"/>
-          <w:szCs w:val="24"/>
-        </w:rPr>
-        <w:t xml:space="preserve">[Confirm each sentence. If she did say how she knew, say what she said.]</w:t>
+        <w:t xml:space="preserve">, told me that she had noticed that I had been speaking with people in online games, and that I needed to stop. I had not told her about those conversations. </w:t>
+      </w:r>
+      <w:r>
+        <w:rPr>
+          <w:rFonts w:ascii="Times New Roman" w:cs="Times New Roman" w:eastAsia="Times New Roman" w:hAnsi="Times New Roman"/>
+          <w:b/>
+          <w:bCs/>
+          <w:sz w:val="24"/>
+          <w:szCs w:val="24"/>
+        </w:rPr>
+        <w:t xml:space="preserve">[Confirm.]</w:t>
       </w:r>
     </w:p>
     <w:p>
@@ -1313,7 +1313,7 @@
           <w:sz w:val="24"/>
           <w:szCs w:val="24"/>
         </w:rPr>
-        <w:t xml:space="preserve">22. I have not spoken with anyone in an online game since my probation officer gave me that instruction. </w:t>
+        <w:t xml:space="preserve">22. No one told me to stop playing video games. But after my probation officer gave me that instruction, I stopped playing online games altogether, and I have not played since. I have not spoken with anyone in an online game since then. </w:t>
       </w:r>
       <w:r>
         <w:rPr>
@@ -2082,32 +2082,32 @@
           <w:sz w:val="24"/>
           <w:szCs w:val="24"/>
         </w:rPr>
-        <w:t xml:space="preserve">37. </w:t>
-      </w:r>
-      <w:r>
-        <w:rPr>
-          <w:rFonts w:ascii="Times New Roman" w:cs="Times New Roman" w:eastAsia="Times New Roman" w:hAnsi="Times New Roman"/>
-          <w:b/>
-          <w:bCs/>
-          <w:sz w:val="24"/>
-          <w:szCs w:val="24"/>
-        </w:rPr>
-        <w:t xml:space="preserve">[State what you have been told or shown about what the software captures (for example screen images, typed text, messages, documents, browsing), who told or showed you, and when. Do not say that it records keystrokes unless someone told you so or you have seen it yourself.]</w:t>
-      </w:r>
-    </w:p>
-    <w:p>
-      <w:pPr>
-        <w:spacing w:after="0" w:line="480"/>
-        <w:ind w:firstLine="720"/>
-        <w:jc w:val="both"/>
-      </w:pPr>
-      <w:r>
-        <w:rPr>
-          <w:rFonts w:ascii="Times New Roman" w:cs="Times New Roman" w:eastAsia="Times New Roman" w:hAnsi="Times New Roman"/>
-          <w:sz w:val="24"/>
-          <w:szCs w:val="24"/>
-        </w:rPr>
-        <w:t xml:space="preserve">38. No one from the Probation Office or the monitoring company has told me how the monitoring is designed to avoid reading privileged information, or whether my communications with this Court or my drafts of legal papers are excluded from review. I have not been given any written description of how the monitoring handles that material. </w:t>
+        <w:t xml:space="preserve">37. I was told that the monitoring software can take a full screenshot of my phone’s screen at any time. </w:t>
+      </w:r>
+      <w:r>
+        <w:rPr>
+          <w:rFonts w:ascii="Times New Roman" w:cs="Times New Roman" w:eastAsia="Times New Roman" w:hAnsi="Times New Roman"/>
+          <w:b/>
+          <w:bCs/>
+          <w:sz w:val="24"/>
+          <w:szCs w:val="24"/>
+        </w:rPr>
+        <w:t xml:space="preserve">[Say who told you and when.]</w:t>
+      </w:r>
+    </w:p>
+    <w:p>
+      <w:pPr>
+        <w:spacing w:after="0" w:line="480"/>
+        <w:ind w:firstLine="720"/>
+        <w:jc w:val="both"/>
+      </w:pPr>
+      <w:r>
+        <w:rPr>
+          <w:rFonts w:ascii="Times New Roman" w:cs="Times New Roman" w:eastAsia="Times New Roman" w:hAnsi="Times New Roman"/>
+          <w:sz w:val="24"/>
+          <w:szCs w:val="24"/>
+        </w:rPr>
+        <w:t xml:space="preserve">38. No one from the Probation Office or the monitoring company has told me that anything on my phone is protected from viewing, or that any procedure exists to prevent Probation from viewing lawful material, such as my typed conversations with other players in a game, my communications with this Court, or my drafts of legal papers. No one has told me how the monitoring is designed to avoid reading privileged information. I have not been given any written description of how the monitoring handles any of that material. </w:t>
       </w:r>
       <w:r>
         <w:rPr>

</xml_diff>

<commit_message>
Cert family section: parents separated; mom, stepdad, dad know; sister's kids not expected but could arrive unannounced
Co-Authored-By: Claude Opus 5.5 <noreply@anthropic.com>
Claude-Session: https://claude.ai/code/session_01ScV4zYETA7REj3uJ3M3K7f
</commit_message>
<xml_diff>
--- a/case-files/bernecky/CERTIFICATION-v1.docx
+++ b/case-files/bernecky/CERTIFICATION-v1.docx
@@ -1611,22 +1611,32 @@
           <w:sz w:val="24"/>
           <w:szCs w:val="24"/>
         </w:rPr>
-        <w:t xml:space="preserve">28. My mother, my father, and my sister know about my convictions.</w:t>
-      </w:r>
-    </w:p>
-    <w:p>
-      <w:pPr>
-        <w:spacing w:after="0" w:line="480"/>
-        <w:ind w:firstLine="720"/>
-        <w:jc w:val="both"/>
-      </w:pPr>
-      <w:r>
-        <w:rPr>
-          <w:rFonts w:ascii="Times New Roman" w:cs="Times New Roman" w:eastAsia="Times New Roman" w:hAnsi="Times New Roman"/>
-          <w:sz w:val="24"/>
-          <w:szCs w:val="24"/>
-        </w:rPr>
-        <w:t xml:space="preserve">29. My family gathers at my mother’s home for Thanksgiving, Christmas, and </w:t>
+        <w:t xml:space="preserve">28. My parents are not together. My mother, my stepfather, and my father know about my convictions. </w:t>
+      </w:r>
+      <w:r>
+        <w:rPr>
+          <w:rFonts w:ascii="Times New Roman" w:cs="Times New Roman" w:eastAsia="Times New Roman" w:hAnsi="Times New Roman"/>
+          <w:b/>
+          <w:bCs/>
+          <w:sz w:val="24"/>
+          <w:szCs w:val="24"/>
+        </w:rPr>
+        <w:t xml:space="preserve">[Confirm whether your sister knows.]</w:t>
+      </w:r>
+    </w:p>
+    <w:p>
+      <w:pPr>
+        <w:spacing w:after="0" w:line="480"/>
+        <w:ind w:firstLine="720"/>
+        <w:jc w:val="both"/>
+      </w:pPr>
+      <w:r>
+        <w:rPr>
+          <w:rFonts w:ascii="Times New Roman" w:cs="Times New Roman" w:eastAsia="Times New Roman" w:hAnsi="Times New Roman"/>
+          <w:sz w:val="24"/>
+          <w:szCs w:val="24"/>
+        </w:rPr>
+        <w:t xml:space="preserve">29. My family gathers for Thanksgiving, Christmas, and </w:t>
       </w:r>
       <w:r>
         <w:rPr>
@@ -1644,17 +1654,35 @@
           <w:sz w:val="24"/>
           <w:szCs w:val="24"/>
         </w:rPr>
-        <w:t xml:space="preserve">. My sister brings her children. </w:t>
-      </w:r>
-      <w:r>
-        <w:rPr>
-          <w:rFonts w:ascii="Times New Roman" w:cs="Times New Roman" w:eastAsia="Times New Roman" w:hAnsi="Times New Roman"/>
-          <w:b/>
-          <w:bCs/>
-          <w:sz w:val="24"/>
-          <w:szCs w:val="24"/>
-        </w:rPr>
-        <w:t xml:space="preserve">[Confirm, and name any other children, such as cousins’ children, who are usually there.]</w:t>
+        <w:t xml:space="preserve"> at </w:t>
+      </w:r>
+      <w:r>
+        <w:rPr>
+          <w:rFonts w:ascii="Times New Roman" w:cs="Times New Roman" w:eastAsia="Times New Roman" w:hAnsi="Times New Roman"/>
+          <w:b/>
+          <w:bCs/>
+          <w:sz w:val="24"/>
+          <w:szCs w:val="24"/>
+        </w:rPr>
+        <w:t xml:space="preserve">[whose home or homes]</w:t>
+      </w:r>
+      <w:r>
+        <w:rPr>
+          <w:rFonts w:ascii="Times New Roman" w:cs="Times New Roman" w:eastAsia="Times New Roman" w:hAnsi="Times New Roman"/>
+          <w:sz w:val="24"/>
+          <w:szCs w:val="24"/>
+        </w:rPr>
+        <w:t xml:space="preserve">. My sister and her children are not expected at the gatherings I attend. But family holidays are not planned to the minute, and my sister could arrive with her children without notice while I am there. </w:t>
+      </w:r>
+      <w:r>
+        <w:rPr>
+          <w:rFonts w:ascii="Times New Roman" w:cs="Times New Roman" w:eastAsia="Times New Roman" w:hAnsi="Times New Roman"/>
+          <w:b/>
+          <w:bCs/>
+          <w:sz w:val="24"/>
+          <w:szCs w:val="24"/>
+        </w:rPr>
+        <w:t xml:space="preserve">[Confirm, and name any other children, such as cousins’ children, who could be present.]</w:t>
       </w:r>
     </w:p>
     <w:p>
@@ -1755,7 +1783,7 @@
           <w:sz w:val="24"/>
           <w:szCs w:val="24"/>
         </w:rPr>
-        <w:t xml:space="preserve">32. If the Court approves, I will attend family gatherings only when my mother, my father, or my sister is present, and I will not be alone with any child. </w:t>
+        <w:t xml:space="preserve">32. If my sister arrives with her children while I am at a family gathering, I will not be alone with any child, and my mother, my stepfather, or my father will be present. </w:t>
       </w:r>
       <w:r>
         <w:rPr>

</xml_diff>

<commit_message>
Revert coordinator's direct edits to certification and questions; log client's certification notes for the Writer
Co-Authored-By: Claude Opus 5.5 <noreply@anthropic.com>
Claude-Session: https://claude.ai/code/session_01ScV4zYETA7REj3uJ3M3K7f
</commit_message>
<xml_diff>
--- a/case-files/bernecky/CERTIFICATION-v1.docx
+++ b/case-files/bernecky/CERTIFICATION-v1.docx
@@ -1134,7 +1134,7 @@
           <w:sz w:val="24"/>
           <w:szCs w:val="24"/>
         </w:rPr>
-        <w:t xml:space="preserve">17. I enjoy playing video games. Until the instruction described in paragraphs 19 and 20, I played games on my phone, including games that let players exchange typed messages. I played them only on my phone, which has the Probation Office’s monitoring software installed. </w:t>
+        <w:t xml:space="preserve">17. I play games on my phone. Some of these games let players exchange typed messages. I play these games only on my phone, which has the Probation Office’s monitoring software installed. </w:t>
       </w:r>
       <w:r>
         <w:rPr>
@@ -1238,7 +1238,57 @@
           <w:sz w:val="24"/>
           <w:szCs w:val="24"/>
         </w:rPr>
-        <w:t xml:space="preserve">, told me that she had noticed that I had been speaking with people in online games, and that I needed to stop. I had not told her about those conversations. </w:t>
+        <w:t xml:space="preserve">, told me that she had noticed that I had been speaking with people in online games, and that I needed to stop. She did not tell me how she had noticed. I had not told her about those conversations. </w:t>
+      </w:r>
+      <w:r>
+        <w:rPr>
+          <w:rFonts w:ascii="Times New Roman" w:cs="Times New Roman" w:eastAsia="Times New Roman" w:hAnsi="Times New Roman"/>
+          <w:b/>
+          <w:bCs/>
+          <w:sz w:val="24"/>
+          <w:szCs w:val="24"/>
+        </w:rPr>
+        <w:t xml:space="preserve">[Confirm each sentence. If she did say how she knew, say what she said.]</w:t>
+      </w:r>
+    </w:p>
+    <w:p>
+      <w:pPr>
+        <w:spacing w:after="0" w:line="480"/>
+        <w:ind w:firstLine="720"/>
+        <w:jc w:val="both"/>
+      </w:pPr>
+      <w:r>
+        <w:rPr>
+          <w:rFonts w:ascii="Times New Roman" w:cs="Times New Roman" w:eastAsia="Times New Roman" w:hAnsi="Times New Roman"/>
+          <w:sz w:val="24"/>
+          <w:szCs w:val="24"/>
+        </w:rPr>
+        <w:t xml:space="preserve">20. She told me that I may not speak with anyone while playing online games, because there is no way to verify their age or identity, and that I may not speak with anyone I do not personally know. She told me I may speak with people I know in real life. The instruction is not limited to people under 18. It applies to adults I do not personally know. </w:t>
+      </w:r>
+      <w:r>
+        <w:rPr>
+          <w:rFonts w:ascii="Times New Roman" w:cs="Times New Roman" w:eastAsia="Times New Roman" w:hAnsi="Times New Roman"/>
+          <w:b/>
+          <w:bCs/>
+          <w:sz w:val="24"/>
+          <w:szCs w:val="24"/>
+        </w:rPr>
+        <w:t xml:space="preserve">[Confirm whether she said adults were included or whether that is how you understood “anyone.” Confirm whether the instruction covered only online games or all online communication, such as social media, messaging apps, and forums.]</w:t>
+      </w:r>
+    </w:p>
+    <w:p>
+      <w:pPr>
+        <w:spacing w:after="0" w:line="480"/>
+        <w:ind w:firstLine="720"/>
+        <w:jc w:val="both"/>
+      </w:pPr>
+      <w:r>
+        <w:rPr>
+          <w:rFonts w:ascii="Times New Roman" w:cs="Times New Roman" w:eastAsia="Times New Roman" w:hAnsi="Times New Roman"/>
+          <w:sz w:val="24"/>
+          <w:szCs w:val="24"/>
+        </w:rPr>
+        <w:t xml:space="preserve">21. No one has told me that any person I exchanged messages with in an online game was under 18. </w:t>
       </w:r>
       <w:r>
         <w:rPr>
@@ -1263,57 +1313,7 @@
           <w:sz w:val="24"/>
           <w:szCs w:val="24"/>
         </w:rPr>
-        <w:t xml:space="preserve">20. She told me that I may not speak with anyone while playing online games, because there is no way to verify their age or identity, and that I may not speak with anyone I do not personally know. She told me I may speak with people I know in real life. The instruction is not limited to people under 18. It applies to adults I do not personally know. </w:t>
-      </w:r>
-      <w:r>
-        <w:rPr>
-          <w:rFonts w:ascii="Times New Roman" w:cs="Times New Roman" w:eastAsia="Times New Roman" w:hAnsi="Times New Roman"/>
-          <w:b/>
-          <w:bCs/>
-          <w:sz w:val="24"/>
-          <w:szCs w:val="24"/>
-        </w:rPr>
-        <w:t xml:space="preserve">[Confirm whether she said adults were included or whether that is how you understood “anyone.” Confirm whether the instruction covered only online games or all online communication, such as social media, messaging apps, and forums.]</w:t>
-      </w:r>
-    </w:p>
-    <w:p>
-      <w:pPr>
-        <w:spacing w:after="0" w:line="480"/>
-        <w:ind w:firstLine="720"/>
-        <w:jc w:val="both"/>
-      </w:pPr>
-      <w:r>
-        <w:rPr>
-          <w:rFonts w:ascii="Times New Roman" w:cs="Times New Roman" w:eastAsia="Times New Roman" w:hAnsi="Times New Roman"/>
-          <w:sz w:val="24"/>
-          <w:szCs w:val="24"/>
-        </w:rPr>
-        <w:t xml:space="preserve">21. No one has told me that any person I exchanged messages with in an online game was under 18. </w:t>
-      </w:r>
-      <w:r>
-        <w:rPr>
-          <w:rFonts w:ascii="Times New Roman" w:cs="Times New Roman" w:eastAsia="Times New Roman" w:hAnsi="Times New Roman"/>
-          <w:b/>
-          <w:bCs/>
-          <w:sz w:val="24"/>
-          <w:szCs w:val="24"/>
-        </w:rPr>
-        <w:t xml:space="preserve">[Confirm.]</w:t>
-      </w:r>
-    </w:p>
-    <w:p>
-      <w:pPr>
-        <w:spacing w:after="0" w:line="480"/>
-        <w:ind w:firstLine="720"/>
-        <w:jc w:val="both"/>
-      </w:pPr>
-      <w:r>
-        <w:rPr>
-          <w:rFonts w:ascii="Times New Roman" w:cs="Times New Roman" w:eastAsia="Times New Roman" w:hAnsi="Times New Roman"/>
-          <w:sz w:val="24"/>
-          <w:szCs w:val="24"/>
-        </w:rPr>
-        <w:t xml:space="preserve">22. No one told me to stop playing video games. But after my probation officer gave me that instruction, I stopped playing online games altogether, and I have not played since. I have not spoken with anyone in an online game since then. </w:t>
+        <w:t xml:space="preserve">22. I have not spoken with anyone in an online game since my probation officer gave me that instruction. </w:t>
       </w:r>
       <w:r>
         <w:rPr>
@@ -1490,17 +1490,17 @@
           <w:sz w:val="24"/>
           <w:szCs w:val="24"/>
         </w:rPr>
-        <w:t xml:space="preserve">25. My probation officer then told me that I should not have gone, because minors could possibly have been there, including minors who could have snuck in without my knowing. I said that a grocery store carries a much greater chance of being near minors than an event like that. She answered, “a judge wouldn’t see it that way.” </w:t>
-      </w:r>
-      <w:r>
-        <w:rPr>
-          <w:rFonts w:ascii="Times New Roman" w:cs="Times New Roman" w:eastAsia="Times New Roman" w:hAnsi="Times New Roman"/>
-          <w:b/>
-          <w:bCs/>
-          <w:sz w:val="24"/>
-          <w:szCs w:val="24"/>
-        </w:rPr>
-        <w:t xml:space="preserve">[Give the date, say how Probation learned of the event, and say whether “snuck in” was her exact wording or the substance of what she said.]</w:t>
+        <w:t xml:space="preserve">25. My probation officer then told me that I should not have gone, because minors could possibly have been there, including minors who could have snuck in without my knowing. I said that a grocery store carries a much greater chance of being near minors than an event like that. She answered that a judge would not see it that way. </w:t>
+      </w:r>
+      <w:r>
+        <w:rPr>
+          <w:rFonts w:ascii="Times New Roman" w:cs="Times New Roman" w:eastAsia="Times New Roman" w:hAnsi="Times New Roman"/>
+          <w:b/>
+          <w:bCs/>
+          <w:sz w:val="24"/>
+          <w:szCs w:val="24"/>
+        </w:rPr>
+        <w:t xml:space="preserve">[Give the date, say how Probation learned of the event, and say whether these are her exact words or the substance of what she said.]</w:t>
       </w:r>
     </w:p>
     <w:p>
@@ -1611,32 +1611,22 @@
           <w:sz w:val="24"/>
           <w:szCs w:val="24"/>
         </w:rPr>
-        <w:t xml:space="preserve">28. My parents are not together. My mother, my stepfather, and my father know about my convictions. </w:t>
-      </w:r>
-      <w:r>
-        <w:rPr>
-          <w:rFonts w:ascii="Times New Roman" w:cs="Times New Roman" w:eastAsia="Times New Roman" w:hAnsi="Times New Roman"/>
-          <w:b/>
-          <w:bCs/>
-          <w:sz w:val="24"/>
-          <w:szCs w:val="24"/>
-        </w:rPr>
-        <w:t xml:space="preserve">[Confirm whether your sister knows.]</w:t>
-      </w:r>
-    </w:p>
-    <w:p>
-      <w:pPr>
-        <w:spacing w:after="0" w:line="480"/>
-        <w:ind w:firstLine="720"/>
-        <w:jc w:val="both"/>
-      </w:pPr>
-      <w:r>
-        <w:rPr>
-          <w:rFonts w:ascii="Times New Roman" w:cs="Times New Roman" w:eastAsia="Times New Roman" w:hAnsi="Times New Roman"/>
-          <w:sz w:val="24"/>
-          <w:szCs w:val="24"/>
-        </w:rPr>
-        <w:t xml:space="preserve">29. My family gathers for Thanksgiving, Christmas, and </w:t>
+        <w:t xml:space="preserve">28. My mother, my father, and my sister know about my convictions.</w:t>
+      </w:r>
+    </w:p>
+    <w:p>
+      <w:pPr>
+        <w:spacing w:after="0" w:line="480"/>
+        <w:ind w:firstLine="720"/>
+        <w:jc w:val="both"/>
+      </w:pPr>
+      <w:r>
+        <w:rPr>
+          <w:rFonts w:ascii="Times New Roman" w:cs="Times New Roman" w:eastAsia="Times New Roman" w:hAnsi="Times New Roman"/>
+          <w:sz w:val="24"/>
+          <w:szCs w:val="24"/>
+        </w:rPr>
+        <w:t xml:space="preserve">29. My family gathers at my mother’s home for Thanksgiving, Christmas, and </w:t>
       </w:r>
       <w:r>
         <w:rPr>
@@ -1654,35 +1644,17 @@
           <w:sz w:val="24"/>
           <w:szCs w:val="24"/>
         </w:rPr>
-        <w:t xml:space="preserve"> at </w:t>
-      </w:r>
-      <w:r>
-        <w:rPr>
-          <w:rFonts w:ascii="Times New Roman" w:cs="Times New Roman" w:eastAsia="Times New Roman" w:hAnsi="Times New Roman"/>
-          <w:b/>
-          <w:bCs/>
-          <w:sz w:val="24"/>
-          <w:szCs w:val="24"/>
-        </w:rPr>
-        <w:t xml:space="preserve">[whose home or homes]</w:t>
-      </w:r>
-      <w:r>
-        <w:rPr>
-          <w:rFonts w:ascii="Times New Roman" w:cs="Times New Roman" w:eastAsia="Times New Roman" w:hAnsi="Times New Roman"/>
-          <w:sz w:val="24"/>
-          <w:szCs w:val="24"/>
-        </w:rPr>
-        <w:t xml:space="preserve">. My sister and her children are not expected at the gatherings I attend. But family holidays are not planned to the minute, and my sister could arrive with her children without notice while I am there. </w:t>
-      </w:r>
-      <w:r>
-        <w:rPr>
-          <w:rFonts w:ascii="Times New Roman" w:cs="Times New Roman" w:eastAsia="Times New Roman" w:hAnsi="Times New Roman"/>
-          <w:b/>
-          <w:bCs/>
-          <w:sz w:val="24"/>
-          <w:szCs w:val="24"/>
-        </w:rPr>
-        <w:t xml:space="preserve">[Confirm, and name any other children, such as cousins’ children, who could be present.]</w:t>
+        <w:t xml:space="preserve">. My sister brings her children. </w:t>
+      </w:r>
+      <w:r>
+        <w:rPr>
+          <w:rFonts w:ascii="Times New Roman" w:cs="Times New Roman" w:eastAsia="Times New Roman" w:hAnsi="Times New Roman"/>
+          <w:b/>
+          <w:bCs/>
+          <w:sz w:val="24"/>
+          <w:szCs w:val="24"/>
+        </w:rPr>
+        <w:t xml:space="preserve">[Confirm, and name any other children, such as cousins’ children, who are usually there.]</w:t>
       </w:r>
     </w:p>
     <w:p>
@@ -1783,7 +1755,7 @@
           <w:sz w:val="24"/>
           <w:szCs w:val="24"/>
         </w:rPr>
-        <w:t xml:space="preserve">32. If my sister arrives with her children while I am at a family gathering, I will not be alone with any child, and my mother, my stepfather, or my father will be present. </w:t>
+        <w:t xml:space="preserve">32. If the Court approves, I will attend family gatherings only when my mother, my father, or my sister is present, and I will not be alone with any child. </w:t>
       </w:r>
       <w:r>
         <w:rPr>
@@ -2110,32 +2082,32 @@
           <w:sz w:val="24"/>
           <w:szCs w:val="24"/>
         </w:rPr>
-        <w:t xml:space="preserve">37. I was told that the monitoring software can take a full screenshot of my phone’s screen at any time. </w:t>
-      </w:r>
-      <w:r>
-        <w:rPr>
-          <w:rFonts w:ascii="Times New Roman" w:cs="Times New Roman" w:eastAsia="Times New Roman" w:hAnsi="Times New Roman"/>
-          <w:b/>
-          <w:bCs/>
-          <w:sz w:val="24"/>
-          <w:szCs w:val="24"/>
-        </w:rPr>
-        <w:t xml:space="preserve">[Say who told you and when.]</w:t>
-      </w:r>
-    </w:p>
-    <w:p>
-      <w:pPr>
-        <w:spacing w:after="0" w:line="480"/>
-        <w:ind w:firstLine="720"/>
-        <w:jc w:val="both"/>
-      </w:pPr>
-      <w:r>
-        <w:rPr>
-          <w:rFonts w:ascii="Times New Roman" w:cs="Times New Roman" w:eastAsia="Times New Roman" w:hAnsi="Times New Roman"/>
-          <w:sz w:val="24"/>
-          <w:szCs w:val="24"/>
-        </w:rPr>
-        <w:t xml:space="preserve">38. No one from the Probation Office or the monitoring company has told me that anything on my phone is protected from viewing, or that any procedure exists to prevent Probation from viewing lawful material, such as my typed conversations with other players in a game, my communications with this Court, or my drafts of legal papers. No one has told me how the monitoring is designed to avoid reading privileged information. I have not been given any written description of how the monitoring handles any of that material. </w:t>
+        <w:t xml:space="preserve">37. </w:t>
+      </w:r>
+      <w:r>
+        <w:rPr>
+          <w:rFonts w:ascii="Times New Roman" w:cs="Times New Roman" w:eastAsia="Times New Roman" w:hAnsi="Times New Roman"/>
+          <w:b/>
+          <w:bCs/>
+          <w:sz w:val="24"/>
+          <w:szCs w:val="24"/>
+        </w:rPr>
+        <w:t xml:space="preserve">[State what you have been told or shown about what the software captures (for example screen images, typed text, messages, documents, browsing), who told or showed you, and when. Do not say that it records keystrokes unless someone told you so or you have seen it yourself.]</w:t>
+      </w:r>
+    </w:p>
+    <w:p>
+      <w:pPr>
+        <w:spacing w:after="0" w:line="480"/>
+        <w:ind w:firstLine="720"/>
+        <w:jc w:val="both"/>
+      </w:pPr>
+      <w:r>
+        <w:rPr>
+          <w:rFonts w:ascii="Times New Roman" w:cs="Times New Roman" w:eastAsia="Times New Roman" w:hAnsi="Times New Roman"/>
+          <w:sz w:val="24"/>
+          <w:szCs w:val="24"/>
+        </w:rPr>
+        <w:t xml:space="preserve">38. No one from the Probation Office or the monitoring company has told me how the monitoring is designed to avoid reading privileged information, or whether my communications with this Court or my drafts of legal papers are excluded from review. I have not been given any written description of how the monitoring handles that material. </w:t>
       </w:r>
       <w:r>
         <w:rPr>

</xml_diff>